<commit_message>
fix(informes): resync sprint evidence line refs with header-block comments
Adding the required object header comments (Nombre de Objeto/Fecha de
Creación/Propietario/Requerimiento/Descripción) shifted line numbers in
10 files cited by exact line range in Sprint 1/2/5/6/7/12/13 Evidencias
sections. Recomputed and verified each snippet byte-for-byte against the
current source, then regenerated the corresponding docx files.

Co-Authored-By: Claude Sonnet 5 <noreply@anthropic.com>
</commit_message>
<xml_diff>
--- a/Documentation/informes/Plan_Iteracion_Sprint12_RespiCare.docx
+++ b/Documentation/informes/Plan_Iteracion_Sprint12_RespiCare.docx
@@ -725,6 +725,144 @@
           <w:sz w:val="24"/>
         </w:rPr>
         <w:t>Entregables de otras iteraciones (Sprint 11 y anteriores ya cerrados; Sprint - y posteriores aún no iniciados).</w:t>
+      </w:r>
+    </w:p>
+    <w:p>
+      <w:pPr>
+        <w:jc w:val="both"/>
+      </w:pPr>
+      <w:r>
+        <w:rPr>
+          <w:rFonts w:ascii="Times New Roman" w:hAnsi="Times New Roman" w:cs="Times New Roman"/>
+          <w:b/>
+          <w:i w:val="0"/>
+          <w:sz w:val="24"/>
+        </w:rPr>
+        <w:t>Requerimientos Funcionales relacionados</w:t>
+      </w:r>
+      <w:r>
+        <w:rPr>
+          <w:rFonts w:ascii="Times New Roman" w:hAnsi="Times New Roman" w:cs="Times New Roman"/>
+          <w:b w:val="0"/>
+          <w:i w:val="0"/>
+          <w:sz w:val="24"/>
+        </w:rPr>
+        <w:t xml:space="preserve"> (Documentation/trazabilidad/Matriz_Trazabilidad_RespiCare.xlsx):</w:t>
+      </w:r>
+    </w:p>
+    <w:p>
+      <w:pPr>
+        <w:pStyle w:val="ListBullet"/>
+      </w:pPr>
+      <w:r>
+        <w:rPr>
+          <w:rFonts w:ascii="Times New Roman" w:hAnsi="Times New Roman" w:cs="Times New Roman"/>
+          <w:b/>
+          <w:i w:val="0"/>
+          <w:sz w:val="24"/>
+        </w:rPr>
+        <w:t>RF-002</w:t>
+      </w:r>
+      <w:r>
+        <w:rPr>
+          <w:rFonts w:ascii="Times New Roman" w:hAnsi="Times New Roman" w:cs="Times New Roman"/>
+          <w:b w:val="0"/>
+          <w:i w:val="0"/>
+          <w:sz w:val="24"/>
+        </w:rPr>
+        <w:t>: Diagnóstico inteligente de síntomas — extensión — modelos predictivos</w:t>
+      </w:r>
+    </w:p>
+    <w:p>
+      <w:pPr>
+        <w:pStyle w:val="ListBullet"/>
+      </w:pPr>
+      <w:r>
+        <w:rPr>
+          <w:rFonts w:ascii="Times New Roman" w:hAnsi="Times New Roman" w:cs="Times New Roman"/>
+          <w:b/>
+          <w:i w:val="0"/>
+          <w:sz w:val="24"/>
+        </w:rPr>
+        <w:t>RF-010</w:t>
+      </w:r>
+      <w:r>
+        <w:rPr>
+          <w:rFonts w:ascii="Times New Roman" w:hAnsi="Times New Roman" w:cs="Times New Roman"/>
+          <w:b w:val="0"/>
+          <w:i w:val="0"/>
+          <w:sz w:val="24"/>
+        </w:rPr>
+        <w:t>: Reportes y estadísticas — extensión</w:t>
+      </w:r>
+    </w:p>
+    <w:p>
+      <w:pPr>
+        <w:jc w:val="both"/>
+      </w:pPr>
+      <w:r>
+        <w:rPr>
+          <w:rFonts w:ascii="Times New Roman" w:hAnsi="Times New Roman" w:cs="Times New Roman"/>
+          <w:b/>
+          <w:i w:val="0"/>
+          <w:sz w:val="24"/>
+        </w:rPr>
+        <w:t>Requerimientos No Funcionales relacionados</w:t>
+      </w:r>
+      <w:r>
+        <w:rPr>
+          <w:rFonts w:ascii="Times New Roman" w:hAnsi="Times New Roman" w:cs="Times New Roman"/>
+          <w:b w:val="0"/>
+          <w:i w:val="0"/>
+          <w:sz w:val="24"/>
+        </w:rPr>
+        <w:t xml:space="preserve"> (FD03-EPIS-Informe SRS de Proyecto.docx, Cuadro de Requerimientos No Funcionales):</w:t>
+      </w:r>
+    </w:p>
+    <w:p>
+      <w:pPr>
+        <w:pStyle w:val="ListBullet"/>
+      </w:pPr>
+      <w:r>
+        <w:rPr>
+          <w:rFonts w:ascii="Times New Roman" w:hAnsi="Times New Roman" w:cs="Times New Roman"/>
+          <w:b/>
+          <w:i w:val="0"/>
+          <w:sz w:val="24"/>
+        </w:rPr>
+        <w:t>RNF-012</w:t>
+      </w:r>
+      <w:r>
+        <w:rPr>
+          <w:rFonts w:ascii="Times New Roman" w:hAnsi="Times New Roman" w:cs="Times New Roman"/>
+          <w:b w:val="0"/>
+          <w:i w:val="0"/>
+          <w:sz w:val="24"/>
+        </w:rPr>
+        <w:t>: Cobertura de pruebas</w:t>
+      </w:r>
+    </w:p>
+    <w:p>
+      <w:pPr>
+        <w:pStyle w:val="ListBullet"/>
+      </w:pPr>
+      <w:r>
+        <w:rPr>
+          <w:rFonts w:ascii="Times New Roman" w:hAnsi="Times New Roman" w:cs="Times New Roman"/>
+          <w:b/>
+          <w:i w:val="0"/>
+          <w:sz w:val="24"/>
+        </w:rPr>
+        <w:t>RNF-007</w:t>
+      </w:r>
+      <w:r>
+        <w:rPr>
+          <w:rFonts w:ascii="Times New Roman" w:hAnsi="Times New Roman" w:cs="Times New Roman"/>
+          <w:b w:val="0"/>
+          <w:i w:val="0"/>
+          <w:sz w:val="24"/>
+        </w:rPr>
+        <w:t>: Precisión</w:t>
       </w:r>
     </w:p>
     <w:p>
@@ -3007,6 +3145,600 @@
     <w:p/>
     <w:p>
       <w:pPr>
+        <w:jc w:val="both"/>
+      </w:pPr>
+      <w:r>
+        <w:rPr>
+          <w:rFonts w:ascii="Times New Roman" w:hAnsi="Times New Roman" w:cs="Times New Roman"/>
+          <w:b/>
+          <w:i w:val="0"/>
+          <w:sz w:val="24"/>
+        </w:rPr>
+        <w:t>Evidencia de código (extractos reales verificados del repositorio):</w:t>
+      </w:r>
+    </w:p>
+    <w:p>
+      <w:pPr>
+        <w:jc w:val="both"/>
+      </w:pPr>
+      <w:r>
+        <w:rPr>
+          <w:rFonts w:ascii="Times New Roman" w:hAnsi="Times New Roman" w:cs="Times New Roman"/>
+          <w:b w:val="0"/>
+          <w:i/>
+          <w:sz w:val="24"/>
+        </w:rPr>
+        <w:t>Entregable: Modelos ML: trend_predictor.py</w:t>
+      </w:r>
+    </w:p>
+    <w:p>
+      <w:pPr>
+        <w:jc w:val="both"/>
+      </w:pPr>
+      <w:r>
+        <w:rPr>
+          <w:rFonts w:ascii="Consolas" w:hAnsi="Consolas" w:cs="Consolas"/>
+          <w:b w:val="0"/>
+          <w:i w:val="0"/>
+          <w:sz w:val="18"/>
+        </w:rPr>
+        <w:t>ai-services/ml_models/trend_predictor.py</w:t>
+      </w:r>
+      <w:r>
+        <w:rPr>
+          <w:rFonts w:ascii="Times New Roman" w:hAnsi="Times New Roman" w:cs="Times New Roman"/>
+          <w:b w:val="0"/>
+          <w:i w:val="0"/>
+          <w:sz w:val="24"/>
+        </w:rPr>
+        <w:t xml:space="preserve"> (líneas 50-69):</w:t>
+      </w:r>
+    </w:p>
+    <w:p>
+      <w:pPr>
+        <w:spacing w:after="0" w:before="0"/>
+      </w:pPr>
+      <w:r>
+        <w:rPr>
+          <w:rFonts w:ascii="Consolas" w:hAnsi="Consolas" w:cs="Consolas"/>
+          <w:b w:val="0"/>
+          <w:i w:val="0"/>
+          <w:sz w:val="18"/>
+        </w:rPr>
+        <w:t>def fit(self, data: pd.DataFrame) -&gt; "DiseaseTrendPredictor":</w:t>
+      </w:r>
+    </w:p>
+    <w:p>
+      <w:pPr>
+        <w:spacing w:after="0" w:before="0"/>
+      </w:pPr>
+      <w:r>
+        <w:rPr>
+          <w:rFonts w:ascii="Consolas" w:hAnsi="Consolas" w:cs="Consolas"/>
+          <w:b w:val="0"/>
+          <w:i w:val="0"/>
+          <w:sz w:val="18"/>
+        </w:rPr>
+        <w:t xml:space="preserve">    """</w:t>
+      </w:r>
+    </w:p>
+    <w:p>
+      <w:pPr>
+        <w:spacing w:after="0" w:before="0"/>
+      </w:pPr>
+      <w:r>
+        <w:rPr>
+          <w:rFonts w:ascii="Consolas" w:hAnsi="Consolas" w:cs="Consolas"/>
+          <w:b w:val="0"/>
+          <w:i w:val="0"/>
+          <w:sz w:val="18"/>
+        </w:rPr>
+        <w:t xml:space="preserve">    Ajusta el predictor con datos históricos.</w:t>
+      </w:r>
+    </w:p>
+    <w:p>
+      <w:pPr>
+        <w:spacing w:after="0" w:before="0"/>
+      </w:pPr>
+      <w:r>
+        <w:rPr>
+          <w:rFonts w:ascii="Consolas" w:hAnsi="Consolas" w:cs="Consolas"/>
+          <w:b w:val="0"/>
+          <w:i w:val="0"/>
+          <w:sz w:val="18"/>
+        </w:rPr>
+        <w:t xml:space="preserve"> </w:t>
+      </w:r>
+    </w:p>
+    <w:p>
+      <w:pPr>
+        <w:spacing w:after="0" w:before="0"/>
+      </w:pPr>
+      <w:r>
+        <w:rPr>
+          <w:rFonts w:ascii="Consolas" w:hAnsi="Consolas" w:cs="Consolas"/>
+          <w:b w:val="0"/>
+          <w:i w:val="0"/>
+          <w:sz w:val="18"/>
+        </w:rPr>
+        <w:t xml:space="preserve">    Espera un DataFrame con las columnas: ``date``, ``disease`` y ``count``.</w:t>
+      </w:r>
+    </w:p>
+    <w:p>
+      <w:pPr>
+        <w:spacing w:after="0" w:before="0"/>
+      </w:pPr>
+      <w:r>
+        <w:rPr>
+          <w:rFonts w:ascii="Consolas" w:hAnsi="Consolas" w:cs="Consolas"/>
+          <w:b w:val="0"/>
+          <w:i w:val="0"/>
+          <w:sz w:val="18"/>
+        </w:rPr>
+        <w:t xml:space="preserve">    La fecha puede venir como string, será convertida a ``datetime64``.</w:t>
+      </w:r>
+    </w:p>
+    <w:p>
+      <w:pPr>
+        <w:spacing w:after="0" w:before="0"/>
+      </w:pPr>
+      <w:r>
+        <w:rPr>
+          <w:rFonts w:ascii="Consolas" w:hAnsi="Consolas" w:cs="Consolas"/>
+          <w:b w:val="0"/>
+          <w:i w:val="0"/>
+          <w:sz w:val="18"/>
+        </w:rPr>
+        <w:t xml:space="preserve">    """</w:t>
+      </w:r>
+    </w:p>
+    <w:p>
+      <w:pPr>
+        <w:spacing w:after="0" w:before="0"/>
+      </w:pPr>
+      <w:r>
+        <w:rPr>
+          <w:rFonts w:ascii="Consolas" w:hAnsi="Consolas" w:cs="Consolas"/>
+          <w:b w:val="0"/>
+          <w:i w:val="0"/>
+          <w:sz w:val="18"/>
+        </w:rPr>
+        <w:t xml:space="preserve">    required_columns = {"date", "disease", "count"}</w:t>
+      </w:r>
+    </w:p>
+    <w:p>
+      <w:pPr>
+        <w:spacing w:after="0" w:before="0"/>
+      </w:pPr>
+      <w:r>
+        <w:rPr>
+          <w:rFonts w:ascii="Consolas" w:hAnsi="Consolas" w:cs="Consolas"/>
+          <w:b w:val="0"/>
+          <w:i w:val="0"/>
+          <w:sz w:val="18"/>
+        </w:rPr>
+        <w:t xml:space="preserve">    if not required_columns.issubset(data.columns):</w:t>
+      </w:r>
+    </w:p>
+    <w:p>
+      <w:pPr>
+        <w:spacing w:after="0" w:before="0"/>
+      </w:pPr>
+      <w:r>
+        <w:rPr>
+          <w:rFonts w:ascii="Consolas" w:hAnsi="Consolas" w:cs="Consolas"/>
+          <w:b w:val="0"/>
+          <w:i w:val="0"/>
+          <w:sz w:val="18"/>
+        </w:rPr>
+        <w:t xml:space="preserve">        missing = required_columns - set(data.columns)</w:t>
+      </w:r>
+    </w:p>
+    <w:p>
+      <w:pPr>
+        <w:spacing w:after="0" w:before="0"/>
+      </w:pPr>
+      <w:r>
+        <w:rPr>
+          <w:rFonts w:ascii="Consolas" w:hAnsi="Consolas" w:cs="Consolas"/>
+          <w:b w:val="0"/>
+          <w:i w:val="0"/>
+          <w:sz w:val="18"/>
+        </w:rPr>
+        <w:t xml:space="preserve">        raise ValueError(f"Faltan columnas requeridas: {missing}")</w:t>
+      </w:r>
+    </w:p>
+    <w:p>
+      <w:pPr>
+        <w:spacing w:after="0" w:before="0"/>
+      </w:pPr>
+      <w:r>
+        <w:rPr>
+          <w:rFonts w:ascii="Consolas" w:hAnsi="Consolas" w:cs="Consolas"/>
+          <w:b w:val="0"/>
+          <w:i w:val="0"/>
+          <w:sz w:val="18"/>
+        </w:rPr>
+        <w:t xml:space="preserve"> </w:t>
+      </w:r>
+    </w:p>
+    <w:p>
+      <w:pPr>
+        <w:spacing w:after="0" w:before="0"/>
+      </w:pPr>
+      <w:r>
+        <w:rPr>
+          <w:rFonts w:ascii="Consolas" w:hAnsi="Consolas" w:cs="Consolas"/>
+          <w:b w:val="0"/>
+          <w:i w:val="0"/>
+          <w:sz w:val="18"/>
+        </w:rPr>
+        <w:t xml:space="preserve">    if data.empty:</w:t>
+      </w:r>
+    </w:p>
+    <w:p>
+      <w:pPr>
+        <w:spacing w:after="0" w:before="0"/>
+      </w:pPr>
+      <w:r>
+        <w:rPr>
+          <w:rFonts w:ascii="Consolas" w:hAnsi="Consolas" w:cs="Consolas"/>
+          <w:b w:val="0"/>
+          <w:i w:val="0"/>
+          <w:sz w:val="18"/>
+        </w:rPr>
+        <w:t xml:space="preserve">        raise ValueError("Se requieren registros históricos para entrenar el predictor.")</w:t>
+      </w:r>
+    </w:p>
+    <w:p>
+      <w:pPr>
+        <w:spacing w:after="0" w:before="0"/>
+      </w:pPr>
+      <w:r>
+        <w:rPr>
+          <w:rFonts w:ascii="Consolas" w:hAnsi="Consolas" w:cs="Consolas"/>
+          <w:b w:val="0"/>
+          <w:i w:val="0"/>
+          <w:sz w:val="18"/>
+        </w:rPr>
+        <w:t xml:space="preserve"> </w:t>
+      </w:r>
+    </w:p>
+    <w:p>
+      <w:pPr>
+        <w:spacing w:after="0" w:before="0"/>
+      </w:pPr>
+      <w:r>
+        <w:rPr>
+          <w:rFonts w:ascii="Consolas" w:hAnsi="Consolas" w:cs="Consolas"/>
+          <w:b w:val="0"/>
+          <w:i w:val="0"/>
+          <w:sz w:val="18"/>
+        </w:rPr>
+        <w:t xml:space="preserve">    df = data.copy()</w:t>
+      </w:r>
+    </w:p>
+    <w:p>
+      <w:pPr>
+        <w:spacing w:after="0" w:before="0"/>
+      </w:pPr>
+      <w:r>
+        <w:rPr>
+          <w:rFonts w:ascii="Consolas" w:hAnsi="Consolas" w:cs="Consolas"/>
+          <w:b w:val="0"/>
+          <w:i w:val="0"/>
+          <w:sz w:val="18"/>
+        </w:rPr>
+        <w:t xml:space="preserve">    df["date"] = pd.to_datetime(df["date"])</w:t>
+      </w:r>
+    </w:p>
+    <w:p>
+      <w:pPr>
+        <w:spacing w:after="0" w:before="0"/>
+      </w:pPr>
+      <w:r>
+        <w:rPr>
+          <w:rFonts w:ascii="Consolas" w:hAnsi="Consolas" w:cs="Consolas"/>
+          <w:b w:val="0"/>
+          <w:i w:val="0"/>
+          <w:sz w:val="18"/>
+        </w:rPr>
+        <w:t xml:space="preserve">    df = df.groupby(["disease", "date"], as_index=False)["count"].sum()</w:t>
+      </w:r>
+    </w:p>
+    <w:p>
+      <w:pPr>
+        <w:spacing w:after="0" w:before="0"/>
+      </w:pPr>
+      <w:r>
+        <w:rPr>
+          <w:rFonts w:ascii="Consolas" w:hAnsi="Consolas" w:cs="Consolas"/>
+          <w:b w:val="0"/>
+          <w:i w:val="0"/>
+          <w:sz w:val="18"/>
+        </w:rPr>
+        <w:t xml:space="preserve">    df = df.sort_values(["disease", "date"])</w:t>
+      </w:r>
+    </w:p>
+    <w:p>
+      <w:pPr>
+        <w:spacing w:after="0" w:before="0"/>
+      </w:pPr>
+      <w:r>
+        <w:rPr>
+          <w:rFonts w:ascii="Consolas" w:hAnsi="Consolas" w:cs="Consolas"/>
+          <w:b w:val="0"/>
+          <w:i w:val="0"/>
+          <w:sz w:val="18"/>
+        </w:rPr>
+        <w:t xml:space="preserve">    self._history = df.reset_index(drop=True)</w:t>
+      </w:r>
+    </w:p>
+    <w:p>
+      <w:pPr>
+        <w:spacing w:after="0" w:before="0"/>
+      </w:pPr>
+      <w:r>
+        <w:rPr>
+          <w:rFonts w:ascii="Consolas" w:hAnsi="Consolas" w:cs="Consolas"/>
+          <w:b w:val="0"/>
+          <w:i w:val="0"/>
+          <w:sz w:val="18"/>
+        </w:rPr>
+        <w:t xml:space="preserve">    return self</w:t>
+      </w:r>
+    </w:p>
+    <w:p/>
+    <w:p>
+      <w:pPr>
+        <w:jc w:val="both"/>
+      </w:pPr>
+      <w:r>
+        <w:rPr>
+          <w:rFonts w:ascii="Times New Roman" w:hAnsi="Times New Roman" w:cs="Times New Roman"/>
+          <w:b w:val="0"/>
+          <w:i/>
+          <w:sz w:val="24"/>
+        </w:rPr>
+        <w:t>Entregable: Endpoints REST de monitoreo (api/routes/ml_monitoring.py)</w:t>
+      </w:r>
+    </w:p>
+    <w:p>
+      <w:pPr>
+        <w:jc w:val="both"/>
+      </w:pPr>
+      <w:r>
+        <w:rPr>
+          <w:rFonts w:ascii="Consolas" w:hAnsi="Consolas" w:cs="Consolas"/>
+          <w:b w:val="0"/>
+          <w:i w:val="0"/>
+          <w:sz w:val="18"/>
+        </w:rPr>
+        <w:t>ai-services/api/routes/ml_monitoring.py</w:t>
+      </w:r>
+      <w:r>
+        <w:rPr>
+          <w:rFonts w:ascii="Times New Roman" w:hAnsi="Times New Roman" w:cs="Times New Roman"/>
+          <w:b w:val="0"/>
+          <w:i w:val="0"/>
+          <w:sz w:val="24"/>
+        </w:rPr>
+        <w:t xml:space="preserve"> (líneas 94-108):</w:t>
+      </w:r>
+    </w:p>
+    <w:p>
+      <w:pPr>
+        <w:spacing w:after="0" w:before="0"/>
+      </w:pPr>
+      <w:r>
+        <w:rPr>
+          <w:rFonts w:ascii="Consolas" w:hAnsi="Consolas" w:cs="Consolas"/>
+          <w:b w:val="0"/>
+          <w:i w:val="0"/>
+          <w:sz w:val="18"/>
+        </w:rPr>
+        <w:t>async def get_monitoring_metrics(days: int = 1) -&gt; Dict[str, Any]:</w:t>
+      </w:r>
+    </w:p>
+    <w:p>
+      <w:pPr>
+        <w:spacing w:after="0" w:before="0"/>
+      </w:pPr>
+      <w:r>
+        <w:rPr>
+          <w:rFonts w:ascii="Consolas" w:hAnsi="Consolas" w:cs="Consolas"/>
+          <w:b w:val="0"/>
+          <w:i w:val="0"/>
+          <w:sz w:val="18"/>
+        </w:rPr>
+        <w:t xml:space="preserve">    """</w:t>
+      </w:r>
+    </w:p>
+    <w:p>
+      <w:pPr>
+        <w:spacing w:after="0" w:before="0"/>
+      </w:pPr>
+      <w:r>
+        <w:rPr>
+          <w:rFonts w:ascii="Consolas" w:hAnsi="Consolas" w:cs="Consolas"/>
+          <w:b w:val="0"/>
+          <w:i w:val="0"/>
+          <w:sz w:val="18"/>
+        </w:rPr>
+        <w:t xml:space="preserve">    Get monitoring metrics for ML predictions</w:t>
+      </w:r>
+    </w:p>
+    <w:p>
+      <w:pPr>
+        <w:spacing w:after="0" w:before="0"/>
+      </w:pPr>
+      <w:r>
+        <w:rPr>
+          <w:rFonts w:ascii="Consolas" w:hAnsi="Consolas" w:cs="Consolas"/>
+          <w:b w:val="0"/>
+          <w:i w:val="0"/>
+          <w:sz w:val="18"/>
+        </w:rPr>
+        <w:t xml:space="preserve">    </w:t>
+      </w:r>
+    </w:p>
+    <w:p>
+      <w:pPr>
+        <w:spacing w:after="0" w:before="0"/>
+      </w:pPr>
+      <w:r>
+        <w:rPr>
+          <w:rFonts w:ascii="Consolas" w:hAnsi="Consolas" w:cs="Consolas"/>
+          <w:b w:val="0"/>
+          <w:i w:val="0"/>
+          <w:sz w:val="18"/>
+        </w:rPr>
+        <w:t xml:space="preserve">    Args:</w:t>
+      </w:r>
+    </w:p>
+    <w:p>
+      <w:pPr>
+        <w:spacing w:after="0" w:before="0"/>
+      </w:pPr>
+      <w:r>
+        <w:rPr>
+          <w:rFonts w:ascii="Consolas" w:hAnsi="Consolas" w:cs="Consolas"/>
+          <w:b w:val="0"/>
+          <w:i w:val="0"/>
+          <w:sz w:val="18"/>
+        </w:rPr>
+        <w:t xml:space="preserve">        days: Number of days to analyze (default: 1)</w:t>
+      </w:r>
+    </w:p>
+    <w:p>
+      <w:pPr>
+        <w:spacing w:after="0" w:before="0"/>
+      </w:pPr>
+      <w:r>
+        <w:rPr>
+          <w:rFonts w:ascii="Consolas" w:hAnsi="Consolas" w:cs="Consolas"/>
+          <w:b w:val="0"/>
+          <w:i w:val="0"/>
+          <w:sz w:val="18"/>
+        </w:rPr>
+        <w:t xml:space="preserve">    </w:t>
+      </w:r>
+    </w:p>
+    <w:p>
+      <w:pPr>
+        <w:spacing w:after="0" w:before="0"/>
+      </w:pPr>
+      <w:r>
+        <w:rPr>
+          <w:rFonts w:ascii="Consolas" w:hAnsi="Consolas" w:cs="Consolas"/>
+          <w:b w:val="0"/>
+          <w:i w:val="0"/>
+          <w:sz w:val="18"/>
+        </w:rPr>
+        <w:t xml:space="preserve">    Returns:</w:t>
+      </w:r>
+    </w:p>
+    <w:p>
+      <w:pPr>
+        <w:spacing w:after="0" w:before="0"/>
+      </w:pPr>
+      <w:r>
+        <w:rPr>
+          <w:rFonts w:ascii="Consolas" w:hAnsi="Consolas" w:cs="Consolas"/>
+          <w:b w:val="0"/>
+          <w:i w:val="0"/>
+          <w:sz w:val="18"/>
+        </w:rPr>
+        <w:t xml:space="preserve">        Monitoring metrics with success flag</w:t>
+      </w:r>
+    </w:p>
+    <w:p>
+      <w:pPr>
+        <w:spacing w:after="0" w:before="0"/>
+      </w:pPr>
+      <w:r>
+        <w:rPr>
+          <w:rFonts w:ascii="Consolas" w:hAnsi="Consolas" w:cs="Consolas"/>
+          <w:b w:val="0"/>
+          <w:i w:val="0"/>
+          <w:sz w:val="18"/>
+        </w:rPr>
+        <w:t xml:space="preserve">    """</w:t>
+      </w:r>
+    </w:p>
+    <w:p>
+      <w:pPr>
+        <w:spacing w:after="0" w:before="0"/>
+      </w:pPr>
+      <w:r>
+        <w:rPr>
+          <w:rFonts w:ascii="Consolas" w:hAnsi="Consolas" w:cs="Consolas"/>
+          <w:b w:val="0"/>
+          <w:i w:val="0"/>
+          <w:sz w:val="18"/>
+        </w:rPr>
+        <w:t xml:space="preserve">    try:</w:t>
+      </w:r>
+    </w:p>
+    <w:p>
+      <w:pPr>
+        <w:spacing w:after="0" w:before="0"/>
+      </w:pPr>
+      <w:r>
+        <w:rPr>
+          <w:rFonts w:ascii="Consolas" w:hAnsi="Consolas" w:cs="Consolas"/>
+          <w:b w:val="0"/>
+          <w:i w:val="0"/>
+          <w:sz w:val="18"/>
+        </w:rPr>
+        <w:t xml:space="preserve">        monitor = get_monitor()</w:t>
+      </w:r>
+    </w:p>
+    <w:p>
+      <w:pPr>
+        <w:spacing w:after="0" w:before="0"/>
+      </w:pPr>
+      <w:r>
+        <w:rPr>
+          <w:rFonts w:ascii="Consolas" w:hAnsi="Consolas" w:cs="Consolas"/>
+          <w:b w:val="0"/>
+          <w:i w:val="0"/>
+          <w:sz w:val="18"/>
+        </w:rPr>
+        <w:t xml:space="preserve">        # Reload predictions to ensure we have latest data</w:t>
+      </w:r>
+    </w:p>
+    <w:p>
+      <w:pPr>
+        <w:spacing w:after="0" w:before="0"/>
+      </w:pPr>
+      <w:r>
+        <w:rPr>
+          <w:rFonts w:ascii="Consolas" w:hAnsi="Consolas" w:cs="Consolas"/>
+          <w:b w:val="0"/>
+          <w:i w:val="0"/>
+          <w:sz w:val="18"/>
+        </w:rPr>
+        <w:t xml:space="preserve">        monitor._load_existing_predictions(days=min(days + 7, 30))  # Load a bit more to ensure we have data</w:t>
+      </w:r>
+    </w:p>
+    <w:p>
+      <w:pPr>
+        <w:spacing w:after="0" w:before="0"/>
+      </w:pPr>
+      <w:r>
+        <w:rPr>
+          <w:rFonts w:ascii="Consolas" w:hAnsi="Consolas" w:cs="Consolas"/>
+          <w:b w:val="0"/>
+          <w:i w:val="0"/>
+          <w:sz w:val="18"/>
+        </w:rPr>
+        <w:t xml:space="preserve">        metrics = monitor.get_metrics(days=days)</w:t>
+      </w:r>
+    </w:p>
+    <w:p/>
+    <w:p>
+      <w:pPr>
         <w:spacing w:before="240" w:after="120"/>
       </w:pPr>
       <w:r>

</xml_diff>